<commit_message>
Address supervisor feedback on project report
- Use lowercase-roman-numeral list markers instead of bullets/numerals in
  Sections 1.2, 1.3.2, and 1.7
- Add chapter-roadmap introductions to Chapter Two, Chapter Three, and
  Chapter Four, ahead of their first numbered subsection
- Add a use case diagram (Fig. 3.2) to Chapter Three, showing the Traffic
  Operator and Emergency Vehicle actors against the scheduler's safety
  layer; renumber the chapter's subsequent figures (3.2-3.4 -> 3.3-3.5)
  accordingly, including the List of Figures and in-text references
- Regenerate the system architecture (Fig. 3.1) and pipeline (Fig. 3.4)
  diagrams with a taller, wrapped layout so they're no longer illegibly
  small on the page
- Add Section 4.7, "Discussion of the Proposed Solution", interpreting the
  Chapter Four results against the product spec's requirements

Co-Authored-By: Claude Sonnet 5 <noreply@anthropic.com>
Claude-Session: https://claude.ai/code/session_01TaquqCcFoEwgGj6GkMMNgr
</commit_message>
<xml_diff>
--- a/docs/PROJECT_SUBMISSION.docx
+++ b/docs/PROJECT_SUBMISSION.docx
@@ -745,15 +745,7 @@
           <w:sz w:val="24"/>
           <w:szCs w:val="24"/>
         </w:rPr>
-        <w:t xml:space="preserve">Table 3.1: Transformer Encoder model hyperparameters</w:t>
-      </w:r>
-      <w:r>
-        <w:rPr>
-          <w:rFonts w:ascii="Times New Roman" w:cs="Times New Roman" w:eastAsia="Times New Roman" w:hAnsi="Times New Roman"/>
-          <w:sz w:val="24"/>
-          <w:szCs w:val="24"/>
-        </w:rPr>
-        <w:t xml:space="preserve">	</w:t>
+        <w:t xml:space="preserve">Table 3.1: Transformer Encoder model hyperparameters	</w:t>
       </w:r>
       <w:r>
         <w:fldChar w:fldCharType="begin" w:dirty="true"/>
@@ -774,15 +766,7 @@
           <w:sz w:val="24"/>
           <w:szCs w:val="24"/>
         </w:rPr>
-        <w:t xml:space="preserve">Table 3.2: Scheduler safety-rule thresholds</w:t>
-      </w:r>
-      <w:r>
-        <w:rPr>
-          <w:rFonts w:ascii="Times New Roman" w:cs="Times New Roman" w:eastAsia="Times New Roman" w:hAnsi="Times New Roman"/>
-          <w:sz w:val="24"/>
-          <w:szCs w:val="24"/>
-        </w:rPr>
-        <w:t xml:space="preserve">	</w:t>
+        <w:t xml:space="preserve">Table 3.2: Scheduler safety-rule thresholds	</w:t>
       </w:r>
       <w:r>
         <w:fldChar w:fldCharType="begin" w:dirty="true"/>
@@ -803,15 +787,7 @@
           <w:sz w:val="24"/>
           <w:szCs w:val="24"/>
         </w:rPr>
-        <w:t xml:space="preserve">Table 4.1: Fitted Poisson arrival-rate parameters by direction and period</w:t>
-      </w:r>
-      <w:r>
-        <w:rPr>
-          <w:rFonts w:ascii="Times New Roman" w:cs="Times New Roman" w:eastAsia="Times New Roman" w:hAnsi="Times New Roman"/>
-          <w:sz w:val="24"/>
-          <w:szCs w:val="24"/>
-        </w:rPr>
-        <w:t xml:space="preserve">	</w:t>
+        <w:t xml:space="preserve">Table 4.1: Fitted Poisson arrival-rate parameters by direction and period	</w:t>
       </w:r>
       <w:r>
         <w:fldChar w:fldCharType="begin" w:dirty="true"/>
@@ -832,15 +808,7 @@
           <w:sz w:val="24"/>
           <w:szCs w:val="24"/>
         </w:rPr>
-        <w:t xml:space="preserve">Table 4.2: Transformer Encoder training result</w:t>
-      </w:r>
-      <w:r>
-        <w:rPr>
-          <w:rFonts w:ascii="Times New Roman" w:cs="Times New Roman" w:eastAsia="Times New Roman" w:hAnsi="Times New Roman"/>
-          <w:sz w:val="24"/>
-          <w:szCs w:val="24"/>
-        </w:rPr>
-        <w:t xml:space="preserve">	</w:t>
+        <w:t xml:space="preserve">Table 4.2: Transformer Encoder training result	</w:t>
       </w:r>
       <w:r>
         <w:fldChar w:fldCharType="begin" w:dirty="true"/>
@@ -861,15 +829,7 @@
           <w:sz w:val="24"/>
           <w:szCs w:val="24"/>
         </w:rPr>
-        <w:t xml:space="preserve">Table 4.3: Intelligent controller vs. fixed-time baseline — Sapon Under-bridge Peak Hour scenario</w:t>
-      </w:r>
-      <w:r>
-        <w:rPr>
-          <w:rFonts w:ascii="Times New Roman" w:cs="Times New Roman" w:eastAsia="Times New Roman" w:hAnsi="Times New Roman"/>
-          <w:sz w:val="24"/>
-          <w:szCs w:val="24"/>
-        </w:rPr>
-        <w:t xml:space="preserve">	</w:t>
+        <w:t xml:space="preserve">Table 4.3: Intelligent controller vs. fixed-time baseline — Sapon Under-bridge Peak Hour scenario	</w:t>
       </w:r>
       <w:r>
         <w:fldChar w:fldCharType="begin" w:dirty="true"/>
@@ -890,15 +850,7 @@
           <w:sz w:val="24"/>
           <w:szCs w:val="24"/>
         </w:rPr>
-        <w:t xml:space="preserve">Table 4.4: Intelligent controller vs. fixed-time baseline — Sapon Under-bridge Off-Peak scenario</w:t>
-      </w:r>
-      <w:r>
-        <w:rPr>
-          <w:rFonts w:ascii="Times New Roman" w:cs="Times New Roman" w:eastAsia="Times New Roman" w:hAnsi="Times New Roman"/>
-          <w:sz w:val="24"/>
-          <w:szCs w:val="24"/>
-        </w:rPr>
-        <w:t xml:space="preserve">	</w:t>
+        <w:t xml:space="preserve">Table 4.4: Intelligent controller vs. fixed-time baseline — Sapon Under-bridge Off-Peak scenario	</w:t>
       </w:r>
       <w:r>
         <w:fldChar w:fldCharType="begin" w:dirty="true"/>
@@ -940,15 +892,7 @@
           <w:sz w:val="24"/>
           <w:szCs w:val="24"/>
         </w:rPr>
-        <w:t xml:space="preserve">Fig. 3.1: MaHanya system architecture and process boundaries</w:t>
-      </w:r>
-      <w:r>
-        <w:rPr>
-          <w:rFonts w:ascii="Times New Roman" w:cs="Times New Roman" w:eastAsia="Times New Roman" w:hAnsi="Times New Roman"/>
-          <w:sz w:val="24"/>
-          <w:szCs w:val="24"/>
-        </w:rPr>
-        <w:t xml:space="preserve">	</w:t>
+        <w:t xml:space="preserve">Fig. 3.1: MaHanya system architecture and process boundaries	</w:t>
       </w:r>
       <w:r>
         <w:fldChar w:fldCharType="begin" w:dirty="true"/>
@@ -969,15 +913,7 @@
           <w:sz w:val="24"/>
           <w:szCs w:val="24"/>
         </w:rPr>
-        <w:t xml:space="preserve">Fig. 3.2: Runtime control-loop detail (observe, predict/pre-empt, validate, apply, log)</w:t>
-      </w:r>
-      <w:r>
-        <w:rPr>
-          <w:rFonts w:ascii="Times New Roman" w:cs="Times New Roman" w:eastAsia="Times New Roman" w:hAnsi="Times New Roman"/>
-          <w:sz w:val="24"/>
-          <w:szCs w:val="24"/>
-        </w:rPr>
-        <w:t xml:space="preserve">	</w:t>
+        <w:t xml:space="preserve">Fig. 3.2: MaHanya use case diagram	</w:t>
       </w:r>
       <w:r>
         <w:fldChar w:fldCharType="begin" w:dirty="true"/>
@@ -998,15 +934,7 @@
           <w:sz w:val="24"/>
           <w:szCs w:val="24"/>
         </w:rPr>
-        <w:t xml:space="preserve">Fig. 3.3: End-to-end pipeline, from field data collection to the dashboard</w:t>
-      </w:r>
-      <w:r>
-        <w:rPr>
-          <w:rFonts w:ascii="Times New Roman" w:cs="Times New Roman" w:eastAsia="Times New Roman" w:hAnsi="Times New Roman"/>
-          <w:sz w:val="24"/>
-          <w:szCs w:val="24"/>
-        </w:rPr>
-        <w:t xml:space="preserve">	</w:t>
+        <w:t xml:space="preserve">Fig. 3.3: Runtime control-loop detail (observe, predict/pre-empt, validate, apply, log)	</w:t>
       </w:r>
       <w:r>
         <w:fldChar w:fldCharType="begin" w:dirty="true"/>
@@ -1027,15 +955,7 @@
           <w:sz w:val="24"/>
           <w:szCs w:val="24"/>
         </w:rPr>
-        <w:t xml:space="preserve">Fig. 3.4: mahanya module dependency graph</w:t>
-      </w:r>
-      <w:r>
-        <w:rPr>
-          <w:rFonts w:ascii="Times New Roman" w:cs="Times New Roman" w:eastAsia="Times New Roman" w:hAnsi="Times New Roman"/>
-          <w:sz w:val="24"/>
-          <w:szCs w:val="24"/>
-        </w:rPr>
-        <w:t xml:space="preserve">	</w:t>
+        <w:t xml:space="preserve">Fig. 3.4: End-to-end pipeline, from field data collection to the dashboard	</w:t>
       </w:r>
       <w:r>
         <w:fldChar w:fldCharType="begin" w:dirty="true"/>
@@ -1056,19 +976,11 @@
           <w:sz w:val="24"/>
           <w:szCs w:val="24"/>
         </w:rPr>
-        <w:t xml:space="preserve">Fig. 4.1: Live Junction dashboard during a live emergency-vehicle pre-emption event</w:t>
-      </w:r>
-      <w:r>
-        <w:rPr>
-          <w:rFonts w:ascii="Times New Roman" w:cs="Times New Roman" w:eastAsia="Times New Roman" w:hAnsi="Times New Roman"/>
-          <w:sz w:val="24"/>
-          <w:szCs w:val="24"/>
-        </w:rPr>
-        <w:t xml:space="preserve">	</w:t>
+        <w:t xml:space="preserve">Fig. 3.5: mahanya module dependency graph	</w:t>
       </w:r>
       <w:r>
         <w:fldChar w:fldCharType="begin" w:dirty="true"/>
-        <w:instrText xml:space="preserve">PAGEREF fig4_1</w:instrText>
+        <w:instrText xml:space="preserve">PAGEREF fig3_5</w:instrText>
         <w:fldChar w:fldCharType="end"/>
       </w:r>
     </w:p>
@@ -1085,19 +997,11 @@
           <w:sz w:val="24"/>
           <w:szCs w:val="24"/>
         </w:rPr>
-        <w:t xml:space="preserve">Fig. 4.2: Live Junction dashboard zoomed in on individual vehicles and per-lane signals</w:t>
-      </w:r>
-      <w:r>
-        <w:rPr>
-          <w:rFonts w:ascii="Times New Roman" w:cs="Times New Roman" w:eastAsia="Times New Roman" w:hAnsi="Times New Roman"/>
-          <w:sz w:val="24"/>
-          <w:szCs w:val="24"/>
-        </w:rPr>
-        <w:t xml:space="preserve">	</w:t>
+        <w:t xml:space="preserve">Fig. 4.1: Live Junction dashboard during a live emergency-vehicle pre-emption event	</w:t>
       </w:r>
       <w:r>
         <w:fldChar w:fldCharType="begin" w:dirty="true"/>
-        <w:instrText xml:space="preserve">PAGEREF fig4_2</w:instrText>
+        <w:instrText xml:space="preserve">PAGEREF fig4_1</w:instrText>
         <w:fldChar w:fldCharType="end"/>
       </w:r>
     </w:p>
@@ -1114,19 +1018,11 @@
           <w:sz w:val="24"/>
           <w:szCs w:val="24"/>
         </w:rPr>
-        <w:t xml:space="preserve">Fig. 4.3: Decision Log page, listing scheduler decisions with their reason codes</w:t>
-      </w:r>
-      <w:r>
-        <w:rPr>
-          <w:rFonts w:ascii="Times New Roman" w:cs="Times New Roman" w:eastAsia="Times New Roman" w:hAnsi="Times New Roman"/>
-          <w:sz w:val="24"/>
-          <w:szCs w:val="24"/>
-        </w:rPr>
-        <w:t xml:space="preserve">	</w:t>
+        <w:t xml:space="preserve">Fig. 4.2: Live Junction dashboard zoomed in on individual vehicles and per-lane signals	</w:t>
       </w:r>
       <w:r>
         <w:fldChar w:fldCharType="begin" w:dirty="true"/>
-        <w:instrText xml:space="preserve">PAGEREF fig4_3</w:instrText>
+        <w:instrText xml:space="preserve">PAGEREF fig4_2</w:instrText>
         <w:fldChar w:fldCharType="end"/>
       </w:r>
     </w:p>
@@ -1143,15 +1039,28 @@
           <w:sz w:val="24"/>
           <w:szCs w:val="24"/>
         </w:rPr>
-        <w:t xml:space="preserve">Fig. 4.4: Evaluation page comparing the intelligent controller against the fixed-time baseline</w:t>
-      </w:r>
-      <w:r>
-        <w:rPr>
-          <w:rFonts w:ascii="Times New Roman" w:cs="Times New Roman" w:eastAsia="Times New Roman" w:hAnsi="Times New Roman"/>
-          <w:sz w:val="24"/>
-          <w:szCs w:val="24"/>
-        </w:rPr>
-        <w:t xml:space="preserve">	</w:t>
+        <w:t xml:space="preserve">Fig. 4.3: Decision Log page, listing scheduler decisions with their reason codes	</w:t>
+      </w:r>
+      <w:r>
+        <w:fldChar w:fldCharType="begin" w:dirty="true"/>
+        <w:instrText xml:space="preserve">PAGEREF fig4_3</w:instrText>
+        <w:fldChar w:fldCharType="end"/>
+      </w:r>
+    </w:p>
+    <w:p>
+      <w:pPr>
+        <w:tabs>
+          <w:tab w:val="right" w:pos="9026" w:leader="dot"/>
+        </w:tabs>
+        <w:spacing w:after="160" w:line="360" w:lineRule="auto"/>
+      </w:pPr>
+      <w:r>
+        <w:rPr>
+          <w:rFonts w:ascii="Times New Roman" w:cs="Times New Roman" w:eastAsia="Times New Roman" w:hAnsi="Times New Roman"/>
+          <w:sz w:val="24"/>
+          <w:szCs w:val="24"/>
+        </w:rPr>
+        <w:t xml:space="preserve">Fig. 4.4: Evaluation page comparing the intelligent controller against the fixed-time baseline	</w:t>
       </w:r>
       <w:r>
         <w:fldChar w:fldCharType="begin" w:dirty="true"/>
@@ -2376,6 +2285,20 @@
     </w:p>
     <w:p>
       <w:pPr>
+        <w:spacing w:after="240" w:line="480" w:lineRule="auto"/>
+        <w:jc w:val="both"/>
+      </w:pPr>
+      <w:r>
+        <w:rPr>
+          <w:rFonts w:ascii="Times New Roman" w:cs="Times New Roman" w:eastAsia="Times New Roman" w:hAnsi="Times New Roman"/>
+          <w:sz w:val="24"/>
+          <w:szCs w:val="24"/>
+        </w:rPr>
+        <w:t xml:space="preserve">This chapter positions MaHanya within four streams of prior work the reader should expect to encounter across the sections that follow. Section 2.1 traces signal control from fixed-time plans through to traffic-responsive systems such as SCOOT and SCATS, establishing the demand-responsive principle this project inherits at a smaller scale. Section 2.2 reviews learned approaches to signal control — reinforcement-learning controllers and, more directly relevant to this project’s own model design, attention-based sequence models applied to phase recommendation. Section 2.3 examines microscopic traffic simulation, and specifically SUMO, as the calibration and evaluation substrate this project and nearly all of the reviewed literature relies on in place of physical field trials. Section 2.4 identifies the gap in that literature this project is built to close: the absence, in most of it, of an explicit, model-independent safety layer standing between a learned controller’s recommendation and the signal state actually applied. Section 2.5 closes the chapter by drawing these four threads together into the specific position MaHanya occupies in the literature reviewed.</w:t>
+      </w:r>
+    </w:p>
+    <w:p>
+      <w:pPr>
         <w:pStyle w:val="Heading2"/>
         <w:keepNext/>
         <w:spacing w:after="200" w:before="320" w:line="360" w:lineRule="auto"/>
@@ -2627,6 +2550,20 @@
     </w:p>
     <w:p>
       <w:pPr>
+        <w:spacing w:after="240" w:line="480" w:lineRule="auto"/>
+        <w:jc w:val="both"/>
+      </w:pPr>
+      <w:r>
+        <w:rPr>
+          <w:rFonts w:ascii="Times New Roman" w:cs="Times New Roman" w:eastAsia="Times New Roman" w:hAnsi="Times New Roman"/>
+          <w:sz w:val="24"/>
+          <w:szCs w:val="24"/>
+        </w:rPr>
+        <w:t xml:space="preserve">This chapter sets out how MaHanya was analysed, designed, and built, in the order a reader encountering the system for the first time would need it explained. Section 3.1 gives a system-level overview of the two independently deployable projects that make up MaHanya and how they communicate, together with a use case diagram showing who and what interacts with the running system and why. Section 3.2 lists the development tools and technology stack the project depends on. Sections 3.3 through 3.6 describe the offline pipeline that produces a trained model: field data collection and statistical calibration, SUMO scenario calibration, sequence generation, and the Transformer Encoder model’s own design. Section 3.7 describes the priority-aware scheduler — the deterministic rule engine that is the sole authority over what signal state is actually applied — and Section 3.8 describes the dashboard that makes the running system’s behaviour visible and auditable in real time. Section 3.9 summarises the full pipeline end to end, Section 3.10 sets out the component and module design within the api/ and web/ projects, and Section 3.11 closes the chapter with the methodology used to evaluate the resulting controller against a fixed-time baseline.</w:t>
+      </w:r>
+    </w:p>
+    <w:p>
+      <w:pPr>
         <w:pStyle w:val="Heading2"/>
         <w:keepNext/>
         <w:spacing w:after="200" w:before="320" w:line="360" w:lineRule="auto"/>
@@ -2665,7 +2602,7 @@
       <w:r>
         <w:drawing>
           <wp:inline distT="0" distB="0" distL="0" distR="0">
-            <wp:extent cx="5562600" cy="771525"/>
+            <wp:extent cx="5562600" cy="1578501"/>
             <wp:effectExtent t="0" r="0" b="0" l="0"/>
             <wp:docPr id="1" name="" descr="" title=""/>
             <wp:cNvGraphicFramePr>
@@ -2690,7 +2627,7 @@
                   <pic:spPr bwMode="auto">
                     <a:xfrm>
                       <a:off x="0" y="0"/>
-                      <a:ext cx="5562600" cy="771525"/>
+                      <a:ext cx="5562600" cy="1578501"/>
                     </a:xfrm>
                     <a:prstGeom prst="rect">
                       <a:avLst/>
@@ -2737,6 +2674,84 @@
     </w:p>
     <w:p>
       <w:pPr>
+        <w:spacing w:after="240" w:line="480" w:lineRule="auto"/>
+        <w:jc w:val="both"/>
+      </w:pPr>
+      <w:r>
+        <w:rPr>
+          <w:rFonts w:ascii="Times New Roman" w:cs="Times New Roman" w:eastAsia="Times New Roman" w:hAnsi="Times New Roman"/>
+          <w:sz w:val="24"/>
+          <w:szCs w:val="24"/>
+        </w:rPr>
+        <w:t xml:space="preserve">Figure 3.2 shows the same system from a use case perspective. A traffic operator monitors live junction state, the scheduler’s decision log, and evaluation results through the dashboard, while an emergency vehicle detected by the simulation triggers pre-emption directly, short-circuiting the model’s own recommendation path. Both actor-triggered flows converge on a single use case, “Validate &amp; apply signal decision,” which is the scheduler’s rule engine described in Section 3.7 and the only path by which any signal state is ever actually applied.</w:t>
+      </w:r>
+    </w:p>
+    <w:p>
+      <w:pPr>
+        <w:spacing w:after="80" w:before="200"/>
+        <w:jc w:val="center"/>
+      </w:pPr>
+      <w:r>
+        <w:drawing>
+          <wp:inline distT="0" distB="0" distL="0" distR="0">
+            <wp:extent cx="4800600" cy="3456432"/>
+            <wp:effectExtent t="0" r="0" b="0" l="0"/>
+            <wp:docPr id="1" name="" descr="" title=""/>
+            <wp:cNvGraphicFramePr>
+              <a:graphicFrameLocks xmlns:a="http://schemas.openxmlformats.org/drawingml/2006/main" noChangeAspect="1"/>
+            </wp:cNvGraphicFramePr>
+            <a:graphic xmlns:a="http://schemas.openxmlformats.org/drawingml/2006/main">
+              <a:graphicData uri="http://schemas.openxmlformats.org/drawingml/2006/picture">
+                <pic:pic xmlns:pic="http://schemas.openxmlformats.org/drawingml/2006/picture">
+                  <pic:nvPicPr>
+                    <pic:cNvPr id="0" name="" descr=""/>
+                    <pic:cNvPicPr>
+                      <a:picLocks noChangeAspect="1" noChangeArrowheads="1"/>
+                    </pic:cNvPicPr>
+                  </pic:nvPicPr>
+                  <pic:blipFill>
+                    <a:blip r:embed="rId18" cstate="none"/>
+                    <a:srcRect/>
+                    <a:stretch>
+                      <a:fillRect/>
+                    </a:stretch>
+                  </pic:blipFill>
+                  <pic:spPr bwMode="auto">
+                    <a:xfrm>
+                      <a:off x="0" y="0"/>
+                      <a:ext cx="4800600" cy="3456432"/>
+                    </a:xfrm>
+                    <a:prstGeom prst="rect">
+                      <a:avLst/>
+                    </a:prstGeom>
+                  </pic:spPr>
+                </pic:pic>
+              </a:graphicData>
+            </a:graphic>
+          </wp:inline>
+        </w:drawing>
+      </w:r>
+    </w:p>
+    <w:p>
+      <w:pPr>
+        <w:spacing w:after="240" w:line="240" w:lineRule="auto"/>
+        <w:jc w:val="center"/>
+      </w:pPr>
+      <w:bookmarkStart w:name="fig3_2" w:id="15"/>
+      <w:r>
+        <w:rPr>
+          <w:rFonts w:ascii="Times New Roman" w:cs="Times New Roman" w:eastAsia="Times New Roman" w:hAnsi="Times New Roman"/>
+          <w:i/>
+          <w:iCs/>
+          <w:sz w:val="22"/>
+          <w:szCs w:val="22"/>
+        </w:rPr>
+        <w:t xml:space="preserve">Fig. 3.2: MaHanya use case diagram</w:t>
+      </w:r>
+      <w:bookmarkEnd w:id="15"/>
+    </w:p>
+    <w:p>
+      <w:pPr>
         <w:pStyle w:val="Heading2"/>
         <w:keepNext/>
         <w:spacing w:after="200" w:before="320" w:line="360" w:lineRule="auto"/>
@@ -2951,17 +2966,7 @@
           <w:sz w:val="24"/>
           <w:szCs w:val="24"/>
         </w:rPr>
-        <w:t xml:space="preserve">Table 3.1: </w:t>
-      </w:r>
-      <w:r>
-        <w:rPr>
-          <w:rFonts w:ascii="Times New Roman" w:cs="Times New Roman" w:eastAsia="Times New Roman" w:hAnsi="Times New Roman"/>
-          <w:b/>
-          <w:bCs/>
-          <w:sz w:val="24"/>
-          <w:szCs w:val="24"/>
-        </w:rPr>
-        <w:t xml:space="preserve">Transformer Encoder model hyperparameters</w:t>
+        <w:t xml:space="preserve">Table 3.1: Transformer Encoder model hyperparameters</w:t>
       </w:r>
       <w:bookmarkEnd w:id="2"/>
     </w:p>
@@ -3823,17 +3828,7 @@
           <w:sz w:val="24"/>
           <w:szCs w:val="24"/>
         </w:rPr>
-        <w:t xml:space="preserve">Table 3.2: </w:t>
-      </w:r>
-      <w:r>
-        <w:rPr>
-          <w:rFonts w:ascii="Times New Roman" w:cs="Times New Roman" w:eastAsia="Times New Roman" w:hAnsi="Times New Roman"/>
-          <w:b/>
-          <w:bCs/>
-          <w:sz w:val="24"/>
-          <w:szCs w:val="24"/>
-        </w:rPr>
-        <w:t xml:space="preserve">Scheduler safety-rule thresholds</w:t>
+        <w:t xml:space="preserve">Table 3.2: Scheduler safety-rule thresholds</w:t>
       </w:r>
       <w:bookmarkEnd w:id="3"/>
     </w:p>
@@ -4388,7 +4383,7 @@
           <w:sz w:val="24"/>
           <w:szCs w:val="24"/>
         </w:rPr>
-        <w:t xml:space="preserve">Every control-loop tick follows the same five-step sequence — observe, then either pre-empt or predict-and-validate, then apply, then log — shown in Figure 3.2. An emergency-vehicle detection on any approach short-circuits the model entirely: the scheduler forces a safe green for the priority approach directly, without consulting the recommendation, and every tick this remains in effect is logged with the emergency_preempt reason code. In every other tick, the model's recommendation is checked against the minimum/maximum-green and anti-starvation rules above before being applied; the resulting decision is logged as model_accepted when the recommendation was applied unmodified, or with the specific overriding reason code (min_green_hold, max_green_force, or anti_starvation_force) when the scheduler held or forced a different phase than the one recommended. This is the mechanism behind the project's non-functional auditability requirement: nothing the scheduler does to a model recommendation is silent.</w:t>
+        <w:t xml:space="preserve">Every control-loop tick follows the same five-step sequence — observe, then either pre-empt or predict-and-validate, then apply, then log — shown in Figure 3.3. An emergency-vehicle detection on any approach short-circuits the model entirely: the scheduler forces a safe green for the priority approach directly, without consulting the recommendation, and every tick this remains in effect is logged with the emergency_preempt reason code. In every other tick, the model's recommendation is checked against the minimum/maximum-green and anti-starvation rules above before being applied; the resulting decision is logged as model_accepted when the recommendation was applied unmodified, or with the specific overriding reason code (min_green_hold, max_green_force, or anti_starvation_force) when the scheduler held or forced a different phase than the one recommended. This is the mechanism behind the project's non-functional auditability requirement: nothing the scheduler does to a model recommendation is silent.</w:t>
       </w:r>
     </w:p>
     <w:p>
@@ -4442,7 +4437,7 @@
         <w:spacing w:after="240" w:line="240" w:lineRule="auto"/>
         <w:jc w:val="center"/>
       </w:pPr>
-      <w:bookmarkStart w:name="fig3_2" w:id="4"/>
+      <w:bookmarkStart w:name="fig3_3" w:id="4"/>
       <w:r>
         <w:rPr>
           <w:rFonts w:ascii="Times New Roman" w:cs="Times New Roman" w:eastAsia="Times New Roman" w:hAnsi="Times New Roman"/>
@@ -4451,7 +4446,7 @@
           <w:sz w:val="22"/>
           <w:szCs w:val="22"/>
         </w:rPr>
-        <w:t xml:space="preserve">Fig. 3.2: Runtime control-loop detail (observe, predict/pre-empt, validate, apply, log)</w:t>
+        <w:t xml:space="preserve">Fig. 3.3: Runtime control-loop detail (observe, predict/pre-empt, validate, apply, log)</w:t>
       </w:r>
       <w:bookmarkEnd w:id="4"/>
     </w:p>
@@ -4562,7 +4557,7 @@
           <w:sz w:val="24"/>
           <w:szCs w:val="24"/>
         </w:rPr>
-        <w:t xml:space="preserve">Figure 3.3 summarises the full pipeline described across Sections 3.3 to 3.8, from field data collection through to the dashboard, showing which stages are offline/batch (data collection, distribution fitting, SUMO calibration, sequence generation, model training, evaluation) and which run live (the runtime control loop and the dashboard it feeds).</w:t>
+        <w:t xml:space="preserve">Figure 3.4 summarises the full pipeline described across Sections 3.3 to 3.8, from field data collection through to the dashboard, showing which stages are offline/batch (data collection, distribution fitting, SUMO calibration, sequence generation, model training, evaluation) and which run live (the runtime control loop and the dashboard it feeds).</w:t>
       </w:r>
     </w:p>
     <w:p>
@@ -4573,7 +4568,7 @@
       <w:r>
         <w:drawing>
           <wp:inline distT="0" distB="0" distL="0" distR="0">
-            <wp:extent cx="5562600" cy="552450"/>
+            <wp:extent cx="5562600" cy="1450998"/>
             <wp:effectExtent t="0" r="0" b="0" l="0"/>
             <wp:docPr id="1" name="" descr="" title=""/>
             <wp:cNvGraphicFramePr>
@@ -4598,7 +4593,7 @@
                   <pic:spPr bwMode="auto">
                     <a:xfrm>
                       <a:off x="0" y="0"/>
-                      <a:ext cx="5562600" cy="552450"/>
+                      <a:ext cx="5562600" cy="1450998"/>
                     </a:xfrm>
                     <a:prstGeom prst="rect">
                       <a:avLst/>
@@ -4616,7 +4611,7 @@
         <w:spacing w:after="240" w:line="240" w:lineRule="auto"/>
         <w:jc w:val="center"/>
       </w:pPr>
-      <w:bookmarkStart w:name="fig3_3" w:id="5"/>
+      <w:bookmarkStart w:name="fig3_4" w:id="5"/>
       <w:r>
         <w:rPr>
           <w:rFonts w:ascii="Times New Roman" w:cs="Times New Roman" w:eastAsia="Times New Roman" w:hAnsi="Times New Roman"/>
@@ -4625,7 +4620,7 @@
           <w:sz w:val="22"/>
           <w:szCs w:val="22"/>
         </w:rPr>
-        <w:t xml:space="preserve">Fig. 3.3: End-to-end pipeline, from field data collection to the dashboard</w:t>
+        <w:t xml:space="preserve">Fig. 3.4: End-to-end pipeline, from field data collection to the dashboard</w:t>
       </w:r>
       <w:bookmarkEnd w:id="5"/>
     </w:p>
@@ -4712,7 +4707,7 @@
         <w:spacing w:after="240" w:line="240" w:lineRule="auto"/>
         <w:jc w:val="center"/>
       </w:pPr>
-      <w:bookmarkStart w:name="fig3_4" w:id="6"/>
+      <w:bookmarkStart w:name="fig3_5" w:id="6"/>
       <w:r>
         <w:rPr>
           <w:rFonts w:ascii="Times New Roman" w:cs="Times New Roman" w:eastAsia="Times New Roman" w:hAnsi="Times New Roman"/>
@@ -4721,7 +4716,7 @@
           <w:sz w:val="22"/>
           <w:szCs w:val="22"/>
         </w:rPr>
-        <w:t xml:space="preserve">Fig. 3.4: mahanya module dependency graph</w:t>
+        <w:t xml:space="preserve">Fig. 3.5: mahanya module dependency graph</w:t>
       </w:r>
       <w:bookmarkEnd w:id="6"/>
     </w:p>
@@ -4794,6 +4789,20 @@
     </w:p>
     <w:p>
       <w:pPr>
+        <w:spacing w:after="240" w:line="480" w:lineRule="auto"/>
+        <w:jc w:val="both"/>
+      </w:pPr>
+      <w:r>
+        <w:rPr>
+          <w:rFonts w:ascii="Times New Roman" w:cs="Times New Roman" w:eastAsia="Times New Roman" w:hAnsi="Times New Roman"/>
+          <w:sz w:val="24"/>
+          <w:szCs w:val="24"/>
+        </w:rPr>
+        <w:t xml:space="preserve">This chapter reports what was actually built and measured, following the same order as the pipeline described in Chapter Three. Section 4.1 gives a brief implementation overview. Section 4.2 reports the field data collection and statistical calibration results — the fitted arrival-rate parameters the SUMO scenarios were built from. Section 4.3 reports the Transformer Encoder’s training result. Section 4.4 walks through the live dashboard as it actually renders a running scenario. Section 4.5 reports the intelligent controller’s evaluation against the fixed-time baseline on both the peak and off-peak scenarios, and Section 4.6 summarises the project’s test coverage. Section 4.7 then discusses what these results, taken together, say about the proposed solution — where it succeeds, where it does not yet outperform the baseline, and why.</w:t>
+      </w:r>
+    </w:p>
+    <w:p>
+      <w:pPr>
         <w:pStyle w:val="Heading2"/>
         <w:keepNext/>
         <w:spacing w:after="200" w:before="320" w:line="360" w:lineRule="auto"/>
@@ -4870,17 +4879,7 @@
           <w:sz w:val="24"/>
           <w:szCs w:val="24"/>
         </w:rPr>
-        <w:t xml:space="preserve">Table 4.1: </w:t>
-      </w:r>
-      <w:r>
-        <w:rPr>
-          <w:rFonts w:ascii="Times New Roman" w:cs="Times New Roman" w:eastAsia="Times New Roman" w:hAnsi="Times New Roman"/>
-          <w:b/>
-          <w:bCs/>
-          <w:sz w:val="24"/>
-          <w:szCs w:val="24"/>
-        </w:rPr>
-        <w:t xml:space="preserve">Fitted Poisson arrival-rate parameters by direction and period</w:t>
+        <w:t xml:space="preserve">Table 4.1: Fitted Poisson arrival-rate parameters by direction and period</w:t>
       </w:r>
       <w:bookmarkEnd w:id="7"/>
     </w:p>
@@ -6250,17 +6249,7 @@
           <w:sz w:val="24"/>
           <w:szCs w:val="24"/>
         </w:rPr>
-        <w:t xml:space="preserve">Table 4.2: </w:t>
-      </w:r>
-      <w:r>
-        <w:rPr>
-          <w:rFonts w:ascii="Times New Roman" w:cs="Times New Roman" w:eastAsia="Times New Roman" w:hAnsi="Times New Roman"/>
-          <w:b/>
-          <w:bCs/>
-          <w:sz w:val="24"/>
-          <w:szCs w:val="24"/>
-        </w:rPr>
-        <w:t xml:space="preserve">Transformer Encoder training result</w:t>
+        <w:t xml:space="preserve">Table 4.2: Transformer Encoder training result</w:t>
       </w:r>
       <w:bookmarkEnd w:id="8"/>
     </w:p>
@@ -7082,17 +7071,7 @@
           <w:sz w:val="24"/>
           <w:szCs w:val="24"/>
         </w:rPr>
-        <w:t xml:space="preserve">Table 4.3: </w:t>
-      </w:r>
-      <w:r>
-        <w:rPr>
-          <w:rFonts w:ascii="Times New Roman" w:cs="Times New Roman" w:eastAsia="Times New Roman" w:hAnsi="Times New Roman"/>
-          <w:b/>
-          <w:bCs/>
-          <w:sz w:val="24"/>
-          <w:szCs w:val="24"/>
-        </w:rPr>
-        <w:t xml:space="preserve">Intelligent controller vs. fixed-time baseline — Sapon Under-bridge Peak Hour scenario</w:t>
+        <w:t xml:space="preserve">Table 4.3: Intelligent controller vs. fixed-time baseline — Sapon Under-bridge Peak Hour scenario</w:t>
       </w:r>
       <w:bookmarkEnd w:id="13"/>
     </w:p>
@@ -7706,17 +7685,7 @@
           <w:sz w:val="24"/>
           <w:szCs w:val="24"/>
         </w:rPr>
-        <w:t xml:space="preserve">Table 4.4: </w:t>
-      </w:r>
-      <w:r>
-        <w:rPr>
-          <w:rFonts w:ascii="Times New Roman" w:cs="Times New Roman" w:eastAsia="Times New Roman" w:hAnsi="Times New Roman"/>
-          <w:b/>
-          <w:bCs/>
-          <w:sz w:val="24"/>
-          <w:szCs w:val="24"/>
-        </w:rPr>
-        <w:t xml:space="preserve">Intelligent controller vs. fixed-time baseline — Sapon Under-bridge Off-Peak scenario</w:t>
+        <w:t xml:space="preserve">Table 4.4: Intelligent controller vs. fixed-time baseline — Sapon Under-bridge Off-Peak scenario</w:t>
       </w:r>
       <w:bookmarkEnd w:id="14"/>
     </w:p>
@@ -8392,6 +8361,66 @@
     </w:p>
     <w:p>
       <w:pPr>
+        <w:pStyle w:val="Heading2"/>
+        <w:keepNext/>
+        <w:spacing w:after="200" w:before="320" w:line="360" w:lineRule="auto"/>
+        <w:jc w:val="left"/>
+      </w:pPr>
+      <w:r>
+        <w:rPr>
+          <w:rFonts w:ascii="Times New Roman" w:cs="Times New Roman" w:eastAsia="Times New Roman" w:hAnsi="Times New Roman"/>
+          <w:b/>
+          <w:bCs/>
+          <w:sz w:val="24"/>
+          <w:szCs w:val="24"/>
+        </w:rPr>
+        <w:t xml:space="preserve">4.7 Discussion of the Proposed Solution</w:t>
+      </w:r>
+    </w:p>
+    <w:p>
+      <w:pPr>
+        <w:spacing w:after="240" w:line="480" w:lineRule="auto"/>
+        <w:jc w:val="both"/>
+      </w:pPr>
+      <w:r>
+        <w:rPr>
+          <w:rFonts w:ascii="Times New Roman" w:cs="Times New Roman" w:eastAsia="Times New Roman" w:hAnsi="Times New Roman"/>
+          <w:sz w:val="24"/>
+          <w:szCs w:val="24"/>
+        </w:rPr>
+        <w:t xml:space="preserve">The results reported in Sections 4.2 through 4.6 support the aim set out in Section 1.3.1: a working, priority-aware intelligent traffic controller was designed, calibrated, and evaluated, and the safety-layered design at the centre of this project’s contribution behaved as intended throughout. The Transformer Encoder reached 91.9% validation accuracy in recommending the phase the scheduler itself went on to log (Section 4.3), and Appendix B’s sample decision-log records show every reason code the scheduler can emit — model_accepted, max_green_force, anti_starvation_force, min_green_hold, and emergency_preempt — actually firing during a real run. Across both evaluation runs and every run made during development, the scheduler was never observed to apply a phase change that violated a minimum green, skipped a mandatory transition interval, or produced two conflicting greens simultaneously (Section 4.5): the deterministic rule engine identified as the gap in the reviewed literature (Section 2.4) held that guarantee in practice, not only by design.</w:t>
+      </w:r>
+    </w:p>
+    <w:p>
+      <w:pPr>
+        <w:spacing w:after="240" w:line="480" w:lineRule="auto"/>
+        <w:jc w:val="both"/>
+      </w:pPr>
+      <w:r>
+        <w:rPr>
+          <w:rFonts w:ascii="Times New Roman" w:cs="Times New Roman" w:eastAsia="Times New Roman" w:hAnsi="Times New Roman"/>
+          <w:sz w:val="24"/>
+          <w:szCs w:val="24"/>
+        </w:rPr>
+        <w:t xml:space="preserve">The evaluation in Section 4.5 is, deliberately, not a uniform win, and the discussion this section owes the reader is why that trade-off is an acceptable one rather than a shortfall to be explained away. Priority-vehicle response time improved by 44.5% on the peak scenario and 43.2% off-peak — the headline goal set out in the product specification, since giving emergency vehicles a systematic priority path through the junction was a stated goal no fixed-time plan can offer by construction. That gain was bought at a small, honestly-reported cost: average waiting time rose by 6.9% on the peak scenario and 31.1% off-peak, and peak-scenario throughput fell by 1.0%. In absolute terms the peak-scenario waiting-time cost is 1.55 seconds per vehicle (23.84s versus 22.29s), and the larger-looking 31.1% off-peak figure is 1.91 seconds per vehicle (8.06s versus 6.15s) — a small absolute price, concentrated on lightly-loaded approaches, for a response-time improvement measured in tens of percent. As Section 4.5 notes, the anti-starvation rule is the most plausible mechanism behind this trade-off: it forces a phase change once a 90-second wait threshold is reached, independent of whether the model’s own recommendation would have chosen differently on efficiency grounds alone, trading a small amount of average-case efficiency for the fairness and pre-emption guarantees the scheduler exists to enforce.</w:t>
+      </w:r>
+    </w:p>
+    <w:p>
+      <w:pPr>
+        <w:spacing w:after="240" w:line="480" w:lineRule="auto"/>
+        <w:jc w:val="both"/>
+      </w:pPr>
+      <w:r>
+        <w:rPr>
+          <w:rFonts w:ascii="Times New Roman" w:cs="Times New Roman" w:eastAsia="Times New Roman" w:hAnsi="Times New Roman"/>
+          <w:sz w:val="24"/>
+          <w:szCs w:val="24"/>
+        </w:rPr>
+        <w:t xml:space="preserve">Read against the functional requirements in the product specification, the proposed solution meets the safety and pre-emption requirements unconditionally, and meets the fixed-time-baseline comparison requirement partially: the controller measurably outperforms the baseline on priority-vehicle response time in both scenarios, but does not yet outperform it on average waiting time or, on the peak scenario, throughput. This result should be read alongside the limitations already scoped in Section 1.6 rather than as a claim about the system’s ceiling: the calibration data is a documented synthetic placeholder pending a genuine field survey, each evaluation scenario is a single fifteen-minute run at one random seed rather than an average over several, and the anti-starvation threshold reported in Table 3.2 was set from engineering judgement rather than tuned against evaluation data. Section 5.4 sets out how each of these specific limitations should be addressed; the point this discussion makes is narrower — that the trade-off this configuration exhibits is a consequence of an explicit, inspectable safety rule rather than of an unexplained modelling weakness, which is itself the kind of result a safety-critical system’s evaluation should be able to produce.</w:t>
+      </w:r>
+    </w:p>
+    <w:p>
+      <w:pPr>
         <w:pStyle w:val="Heading1"/>
         <w:pageBreakBefore/>
         <w:spacing w:after="60" w:before="0" w:line="360" w:lineRule="auto"/>
@@ -9137,67 +9166,18 @@
           <w:szCs w:val="19"/>
         </w:rPr>
         <w:t xml:space="preserve">mahanya fit            Fit per-direction/period arrival distributions from raw field counts.</w:t>
-      </w:r>
-      <w:r>
-        <w:rPr>
-          <w:rFonts w:ascii="Courier New" w:cs="Courier New" w:eastAsia="Courier New" w:hAnsi="Courier New"/>
-          <w:sz w:val="19"/>
-          <w:szCs w:val="19"/>
-        </w:rPr>
         <w:br/>
         <w:t xml:space="preserve">mahanya calibrate      Generate a calibrated .rou.xml + .sumocfg for one period (peak|offpeak).</w:t>
-      </w:r>
-      <w:r>
-        <w:rPr>
-          <w:rFonts w:ascii="Courier New" w:cs="Courier New" w:eastAsia="Courier New" w:hAnsi="Courier New"/>
-          <w:sz w:val="19"/>
-          <w:szCs w:val="19"/>
-        </w:rPr>
         <w:br/>
         <w:t xml:space="preserve">mahanya generate       Generate labelled training sequences from a calibrated scenario.</w:t>
-      </w:r>
-      <w:r>
-        <w:rPr>
-          <w:rFonts w:ascii="Courier New" w:cs="Courier New" w:eastAsia="Courier New" w:hAnsi="Courier New"/>
-          <w:sz w:val="19"/>
-          <w:szCs w:val="19"/>
-        </w:rPr>
         <w:br/>
         <w:t xml:space="preserve">mahanya train          Train the transformer phase recommender.</w:t>
-      </w:r>
-      <w:r>
-        <w:rPr>
-          <w:rFonts w:ascii="Courier New" w:cs="Courier New" w:eastAsia="Courier New" w:hAnsi="Courier New"/>
-          <w:sz w:val="19"/>
-          <w:szCs w:val="19"/>
-        </w:rPr>
         <w:br/>
         <w:t xml:space="preserve">mahanya run            Run one scenario end-to-end through the control loop.</w:t>
-      </w:r>
-      <w:r>
-        <w:rPr>
-          <w:rFonts w:ascii="Courier New" w:cs="Courier New" w:eastAsia="Courier New" w:hAnsi="Courier New"/>
-          <w:sz w:val="19"/>
-          <w:szCs w:val="19"/>
-        </w:rPr>
         <w:br/>
         <w:t xml:space="preserve">mahanya evaluate       Evaluate the intelligent controller against the fixed-time baseline.</w:t>
-      </w:r>
-      <w:r>
-        <w:rPr>
-          <w:rFonts w:ascii="Courier New" w:cs="Courier New" w:eastAsia="Courier New" w:hAnsi="Courier New"/>
-          <w:sz w:val="19"/>
-          <w:szCs w:val="19"/>
-        </w:rPr>
         <w:br/>
         <w:t xml:space="preserve">mahanya serve-api      Run the internal FastAPI relay (serves /api/* for the dashboard).</w:t>
-      </w:r>
-      <w:r>
-        <w:rPr>
-          <w:rFonts w:ascii="Courier New" w:cs="Courier New" w:eastAsia="Courier New" w:hAnsi="Courier New"/>
-          <w:sz w:val="19"/>
-          <w:szCs w:val="19"/>
-        </w:rPr>
         <w:br/>
         <w:t xml:space="preserve">mahanya build-web      Build the Next.js SPA static export.</w:t>
       </w:r>
@@ -9259,24 +9239,50 @@
           <w:szCs w:val="19"/>
         </w:rPr>
         <w:t xml:space="preserve">{"tick": 0, "reasonCode": "model_accepted",</w:t>
-      </w:r>
+        <w:br/>
+        <w:t xml:space="preserve"> "recommendation": {"recommendedPhase": "NORTH_GREEN", "confidence": 0.981},</w:t>
+        <w:br/>
+        <w:t xml:space="preserve"> "appliedPhase": "NORTH_GREEN", "reasonDetail": null}</w:t>
+      </w:r>
+    </w:p>
+    <w:p>
+      <w:pPr>
+        <w:shd w:fill="F2F2F2" w:val="clear"/>
+        <w:spacing w:after="120" w:line="240" w:lineRule="auto"/>
+      </w:pPr>
       <w:r>
         <w:rPr>
           <w:rFonts w:ascii="Courier New" w:cs="Courier New" w:eastAsia="Courier New" w:hAnsi="Courier New"/>
           <w:sz w:val="19"/>
           <w:szCs w:val="19"/>
         </w:rPr>
+        <w:t xml:space="preserve">{"tick": 59, "reasonCode": "max_green_force",</w:t>
         <w:br/>
-        <w:t xml:space="preserve"> "recommendation": {"recommendedPhase": "NORTH_GREEN", "confidence": 0.981},</w:t>
-      </w:r>
+        <w:t xml:space="preserve"> "recommendation": {"recommendedPhase": "NORTH_GREEN", "confidence": 0.984},</w:t>
+        <w:br/>
+        <w:t xml:space="preserve"> "appliedPhase": "NORTH_YELLOW",</w:t>
+        <w:br/>
+        <w:t xml:space="preserve"> "reasonDetail": "NORTH_GREEN reached maximum green duration (60s)"}</w:t>
+      </w:r>
+    </w:p>
+    <w:p>
+      <w:pPr>
+        <w:shd w:fill="F2F2F2" w:val="clear"/>
+        <w:spacing w:after="120" w:line="240" w:lineRule="auto"/>
+      </w:pPr>
       <w:r>
         <w:rPr>
           <w:rFonts w:ascii="Courier New" w:cs="Courier New" w:eastAsia="Courier New" w:hAnsi="Courier New"/>
           <w:sz w:val="19"/>
           <w:szCs w:val="19"/>
         </w:rPr>
+        <w:t xml:space="preserve">{"tick": 90, "reasonCode": "anti_starvation_force",</w:t>
         <w:br/>
-        <w:t xml:space="preserve"> "appliedPhase": "NORTH_GREEN", "reasonDetail": null}</w:t>
+        <w:t xml:space="preserve"> "recommendation": {"recommendedPhase": "SOUTH_GREEN", "confidence": 0.988},</w:t>
+        <w:br/>
+        <w:t xml:space="preserve"> "appliedPhase": "SOUTH_YELLOW",</w:t>
+        <w:br/>
+        <w:t xml:space="preserve"> "reasonDetail": "east approach exceeded max wait threshold (90s)"}</w:t>
       </w:r>
     </w:p>
     <w:p>
@@ -9290,146 +9296,29 @@
           <w:sz w:val="19"/>
           <w:szCs w:val="19"/>
         </w:rPr>
-        <w:t xml:space="preserve">{"tick": 59, "reasonCode": "max_green_force",</w:t>
-      </w:r>
+        <w:t xml:space="preserve">{"tick": 96, "reasonCode": "min_green_hold",</w:t>
+        <w:br/>
+        <w:t xml:space="preserve"> "recommendation": {"recommendedPhase": "EAST_GREEN", "confidence": 0.990},</w:t>
+        <w:br/>
+        <w:t xml:space="preserve"> "appliedPhase": "EAST_GREEN",</w:t>
+        <w:br/>
+        <w:t xml:space="preserve"> "reasonDetail": "EAST_GREEN has 9s remaining before minimum green elapses"}</w:t>
+      </w:r>
+    </w:p>
+    <w:p>
+      <w:pPr>
+        <w:shd w:fill="F2F2F2" w:val="clear"/>
+        <w:spacing w:after="120" w:line="240" w:lineRule="auto"/>
+      </w:pPr>
       <w:r>
         <w:rPr>
           <w:rFonts w:ascii="Courier New" w:cs="Courier New" w:eastAsia="Courier New" w:hAnsi="Courier New"/>
           <w:sz w:val="19"/>
           <w:szCs w:val="19"/>
         </w:rPr>
-        <w:br/>
-        <w:t xml:space="preserve"> "recommendation": {"recommendedPhase": "NORTH_GREEN", "confidence": 0.984},</w:t>
-      </w:r>
-      <w:r>
-        <w:rPr>
-          <w:rFonts w:ascii="Courier New" w:cs="Courier New" w:eastAsia="Courier New" w:hAnsi="Courier New"/>
-          <w:sz w:val="19"/>
-          <w:szCs w:val="19"/>
-        </w:rPr>
-        <w:br/>
-        <w:t xml:space="preserve"> "appliedPhase": "NORTH_YELLOW",</w:t>
-      </w:r>
-      <w:r>
-        <w:rPr>
-          <w:rFonts w:ascii="Courier New" w:cs="Courier New" w:eastAsia="Courier New" w:hAnsi="Courier New"/>
-          <w:sz w:val="19"/>
-          <w:szCs w:val="19"/>
-        </w:rPr>
-        <w:br/>
-        <w:t xml:space="preserve"> "reasonDetail": "NORTH_GREEN reached maximum green duration (60s)"}</w:t>
-      </w:r>
-    </w:p>
-    <w:p>
-      <w:pPr>
-        <w:shd w:fill="F2F2F2" w:val="clear"/>
-        <w:spacing w:after="120" w:line="240" w:lineRule="auto"/>
-      </w:pPr>
-      <w:r>
-        <w:rPr>
-          <w:rFonts w:ascii="Courier New" w:cs="Courier New" w:eastAsia="Courier New" w:hAnsi="Courier New"/>
-          <w:sz w:val="19"/>
-          <w:szCs w:val="19"/>
-        </w:rPr>
-        <w:t xml:space="preserve">{"tick": 90, "reasonCode": "anti_starvation_force",</w:t>
-      </w:r>
-      <w:r>
-        <w:rPr>
-          <w:rFonts w:ascii="Courier New" w:cs="Courier New" w:eastAsia="Courier New" w:hAnsi="Courier New"/>
-          <w:sz w:val="19"/>
-          <w:szCs w:val="19"/>
-        </w:rPr>
-        <w:br/>
-        <w:t xml:space="preserve"> "recommendation": {"recommendedPhase": "SOUTH_GREEN", "confidence": 0.988},</w:t>
-      </w:r>
-      <w:r>
-        <w:rPr>
-          <w:rFonts w:ascii="Courier New" w:cs="Courier New" w:eastAsia="Courier New" w:hAnsi="Courier New"/>
-          <w:sz w:val="19"/>
-          <w:szCs w:val="19"/>
-        </w:rPr>
-        <w:br/>
-        <w:t xml:space="preserve"> "appliedPhase": "SOUTH_YELLOW",</w:t>
-      </w:r>
-      <w:r>
-        <w:rPr>
-          <w:rFonts w:ascii="Courier New" w:cs="Courier New" w:eastAsia="Courier New" w:hAnsi="Courier New"/>
-          <w:sz w:val="19"/>
-          <w:szCs w:val="19"/>
-        </w:rPr>
-        <w:br/>
-        <w:t xml:space="preserve"> "reasonDetail": "east approach exceeded max wait threshold (90s)"}</w:t>
-      </w:r>
-    </w:p>
-    <w:p>
-      <w:pPr>
-        <w:shd w:fill="F2F2F2" w:val="clear"/>
-        <w:spacing w:after="120" w:line="240" w:lineRule="auto"/>
-      </w:pPr>
-      <w:r>
-        <w:rPr>
-          <w:rFonts w:ascii="Courier New" w:cs="Courier New" w:eastAsia="Courier New" w:hAnsi="Courier New"/>
-          <w:sz w:val="19"/>
-          <w:szCs w:val="19"/>
-        </w:rPr>
-        <w:t xml:space="preserve">{"tick": 96, "reasonCode": "min_green_hold",</w:t>
-      </w:r>
-      <w:r>
-        <w:rPr>
-          <w:rFonts w:ascii="Courier New" w:cs="Courier New" w:eastAsia="Courier New" w:hAnsi="Courier New"/>
-          <w:sz w:val="19"/>
-          <w:szCs w:val="19"/>
-        </w:rPr>
-        <w:br/>
-        <w:t xml:space="preserve"> "recommendation": {"recommendedPhase": "EAST_GREEN", "confidence": 0.990},</w:t>
-      </w:r>
-      <w:r>
-        <w:rPr>
-          <w:rFonts w:ascii="Courier New" w:cs="Courier New" w:eastAsia="Courier New" w:hAnsi="Courier New"/>
-          <w:sz w:val="19"/>
-          <w:szCs w:val="19"/>
-        </w:rPr>
-        <w:br/>
-        <w:t xml:space="preserve"> "appliedPhase": "EAST_GREEN",</w:t>
-      </w:r>
-      <w:r>
-        <w:rPr>
-          <w:rFonts w:ascii="Courier New" w:cs="Courier New" w:eastAsia="Courier New" w:hAnsi="Courier New"/>
-          <w:sz w:val="19"/>
-          <w:szCs w:val="19"/>
-        </w:rPr>
-        <w:br/>
-        <w:t xml:space="preserve"> "reasonDetail": "EAST_GREEN has 9s remaining before minimum green elapses"}</w:t>
-      </w:r>
-    </w:p>
-    <w:p>
-      <w:pPr>
-        <w:shd w:fill="F2F2F2" w:val="clear"/>
-        <w:spacing w:after="120" w:line="240" w:lineRule="auto"/>
-      </w:pPr>
-      <w:r>
-        <w:rPr>
-          <w:rFonts w:ascii="Courier New" w:cs="Courier New" w:eastAsia="Courier New" w:hAnsi="Courier New"/>
-          <w:sz w:val="19"/>
-          <w:szCs w:val="19"/>
-        </w:rPr>
         <w:t xml:space="preserve">{"tick": 299, "reasonCode": "emergency_preempt",</w:t>
-      </w:r>
-      <w:r>
-        <w:rPr>
-          <w:rFonts w:ascii="Courier New" w:cs="Courier New" w:eastAsia="Courier New" w:hAnsi="Courier New"/>
-          <w:sz w:val="19"/>
-          <w:szCs w:val="19"/>
-        </w:rPr>
         <w:br/>
         <w:t xml:space="preserve"> "recommendation": null, "appliedPhase": "SOUTH_GREEN",</w:t>
-      </w:r>
-      <w:r>
-        <w:rPr>
-          <w:rFonts w:ascii="Courier New" w:cs="Courier New" w:eastAsia="Courier New" w:hAnsi="Courier New"/>
-          <w:sz w:val="19"/>
-          <w:szCs w:val="19"/>
-        </w:rPr>
         <w:br/>
         <w:t xml:space="preserve"> "reasonDetail": "Holding green for detected emergency vehicle on south approach"}</w:t>
       </w:r>
@@ -9669,8 +9558,8 @@
     <w:multiLevelType w:val="hybridMultilevel"/>
     <w:lvl w:ilvl="0" w15:tentative="1">
       <w:start w:val="1"/>
-      <w:numFmt w:val="bullet"/>
-      <w:lvlText w:val="•"/>
+      <w:numFmt w:val="lowerRoman"/>
+      <w:lvlText w:val="%1."/>
       <w:lvlJc w:val="left"/>
       <w:pPr>
         <w:ind w:left="720" w:hanging="360"/>
@@ -9686,7 +9575,7 @@
     <w:multiLevelType w:val="hybridMultilevel"/>
     <w:lvl w:ilvl="0" w15:tentative="1">
       <w:start w:val="1"/>
-      <w:numFmt w:val="decimal"/>
+      <w:numFmt w:val="lowerRoman"/>
       <w:lvlText w:val="%1."/>
       <w:lvlJc w:val="left"/>
       <w:pPr>
@@ -9703,7 +9592,7 @@
     <w:multiLevelType w:val="hybridMultilevel"/>
     <w:lvl w:ilvl="0" w15:tentative="1">
       <w:start w:val="1"/>
-      <w:numFmt w:val="decimal"/>
+      <w:numFmt w:val="lowerRoman"/>
       <w:lvlText w:val="%1."/>
       <w:lvlJc w:val="left"/>
       <w:pPr>

</xml_diff>